<commit_message>
fix: Arreglar bug de failover
</commit_message>
<xml_diff>
--- a/Documentacion/Pasantía Lomas Documentación Tarea 2.docx
+++ b/Documentacion/Pasantía Lomas Documentación Tarea 2.docx
@@ -115,7 +115,7 @@
           <w:szCs w:val="30"/>
           <w:rtl w:val="0"/>
         </w:rPr>
-        <w:t xml:space="preserve">Por el momento como primera prueba, los 3 nodos más el router se van a levantar en un mismo docker compose.  </w:t>
+        <w:t xml:space="preserve"> </w:t>
       </w:r>
     </w:p>
     <w:p>
@@ -392,7 +392,7 @@
           <w:szCs w:val="30"/>
           <w:rtl w:val="0"/>
         </w:rPr>
-        <w:t xml:space="preserve">Cómo conectar una base de datos levantado con docker a </w:t>
+        <w:t xml:space="preserve"> Conectar una base de datos levantado con docker a </w:t>
       </w:r>
       <w:r>
         <w:rPr>
@@ -411,344 +411,65 @@
         <w:t xml:space="preserve"> y crear una tabla, insertar datos, listar los datos y eliminar los datos.</w:t>
         <w:br w:type="textWrapping"/>
         <w:br w:type="textWrapping"/>
-        <w:t xml:space="preserve">Primero levantar la imagen de docker con el servidor MySQL: </w:t>
-      </w:r>
-    </w:p>
-    <w:p>
-      <w:pPr>
-        <w:rPr>
-          <w:sz w:val="30"/>
-          <w:szCs w:val="30"/>
-        </w:rPr>
-      </w:pPr>
-      <w:r>
-        <w:rPr>
-          <w:sz w:val="30"/>
-          <w:szCs w:val="30"/>
-          <w:rtl w:val="0"/>
-        </w:rPr>
-        <w:t xml:space="preserve">docker run -d --name db1 -e MYSQL_ROOT_PASSWORD=Lauta -e MYSQL_DATABASE=Hola -p 3306:3306 mysql:8.0</w:t>
-      </w:r>
-    </w:p>
-    <w:p>
-      <w:pPr>
-        <w:rPr>
-          <w:sz w:val="30"/>
-          <w:szCs w:val="30"/>
-        </w:rPr>
-      </w:pPr>
-      <w:r>
-        <w:rPr>
-          <w:rtl w:val="0"/>
-        </w:rPr>
-      </w:r>
-    </w:p>
-    <w:p>
-      <w:pPr>
-        <w:rPr>
-          <w:sz w:val="30"/>
-          <w:szCs w:val="30"/>
-        </w:rPr>
-      </w:pPr>
-      <w:r>
-        <w:rPr>
-          <w:sz w:val="30"/>
-          <w:szCs w:val="30"/>
-          <w:rtl w:val="0"/>
-        </w:rPr>
-        <w:t xml:space="preserve">Dentro del proyecto instalar ‘mysql2’:</w:t>
-      </w:r>
-    </w:p>
-    <w:p>
-      <w:pPr>
-        <w:rPr>
-          <w:sz w:val="30"/>
-          <w:szCs w:val="30"/>
-        </w:rPr>
-      </w:pPr>
-      <w:r>
-        <w:rPr>
-          <w:sz w:val="30"/>
-          <w:szCs w:val="30"/>
-          <w:rtl w:val="0"/>
-        </w:rPr>
-        <w:t xml:space="preserve">npm i mysql2</w:t>
-      </w:r>
-    </w:p>
-    <w:p>
-      <w:pPr>
-        <w:rPr>
-          <w:sz w:val="30"/>
-          <w:szCs w:val="30"/>
-        </w:rPr>
-      </w:pPr>
-      <w:r>
-        <w:rPr>
-          <w:rtl w:val="0"/>
-        </w:rPr>
-      </w:r>
-    </w:p>
-    <w:p>
-      <w:pPr>
-        <w:rPr>
-          <w:sz w:val="30"/>
-          <w:szCs w:val="30"/>
-        </w:rPr>
-      </w:pPr>
-      <w:r>
-        <w:rPr>
-          <w:sz w:val="30"/>
-          <w:szCs w:val="30"/>
-          <w:rtl w:val="0"/>
-        </w:rPr>
-        <w:t xml:space="preserve">Código:</w:t>
-      </w:r>
-    </w:p>
-    <w:p>
-      <w:pPr>
-        <w:rPr>
-          <w:sz w:val="30"/>
-          <w:szCs w:val="30"/>
-        </w:rPr>
-      </w:pPr>
-      <w:r>
-        <w:rPr>
-          <w:sz w:val="30"/>
-          <w:szCs w:val="30"/>
-          <w:rtl w:val="0"/>
-        </w:rPr>
-        <w:t xml:space="preserve">https://github.com/Lautaro-1212/pruebasReplicacionMySQL_TiendaNegocio</w:t>
-      </w:r>
-    </w:p>
-    <w:p>
-      <w:pPr>
-        <w:rPr>
-          <w:sz w:val="30"/>
-          <w:szCs w:val="30"/>
-        </w:rPr>
-      </w:pPr>
-      <w:r>
-        <w:rPr>
-          <w:rtl w:val="0"/>
-        </w:rPr>
-      </w:r>
-    </w:p>
-    <w:p>
-      <w:pPr>
-        <w:rPr>
-          <w:sz w:val="30"/>
-          <w:szCs w:val="30"/>
-        </w:rPr>
-      </w:pPr>
-      <w:r>
-        <w:rPr>
-          <w:sz w:val="30"/>
-          <w:szCs w:val="30"/>
-          <w:u w:val="single"/>
-          <w:rtl w:val="0"/>
-        </w:rPr>
-        <w:t xml:space="preserve">Prueba 2:</w:t>
-      </w:r>
-      <w:r>
-        <w:rPr>
-          <w:sz w:val="30"/>
-          <w:szCs w:val="30"/>
-          <w:rtl w:val="0"/>
-        </w:rPr>
-        <w:t xml:space="preserve"> </w:t>
-      </w:r>
-    </w:p>
-    <w:p>
-      <w:pPr>
-        <w:rPr>
-          <w:sz w:val="30"/>
-          <w:szCs w:val="30"/>
-        </w:rPr>
-      </w:pPr>
-      <w:r>
-        <w:rPr>
-          <w:sz w:val="30"/>
-          <w:szCs w:val="30"/>
-          <w:rtl w:val="0"/>
-        </w:rPr>
-        <w:t xml:space="preserve">Usando Multipass crear una imagen, levantar el servidor MySQL dentro usando docker, conectar la base con una API con ‘mysql2’ y por último hacer ecuaciones CRUD.</w:t>
-      </w:r>
-    </w:p>
-    <w:p>
-      <w:pPr>
-        <w:rPr>
-          <w:sz w:val="30"/>
-          <w:szCs w:val="30"/>
-        </w:rPr>
-      </w:pPr>
-      <w:r>
-        <w:rPr>
-          <w:rtl w:val="0"/>
-        </w:rPr>
-      </w:r>
-    </w:p>
-    <w:p>
-      <w:pPr>
-        <w:rPr>
-          <w:sz w:val="30"/>
-          <w:szCs w:val="30"/>
-        </w:rPr>
-      </w:pPr>
-      <w:r>
-        <w:rPr>
-          <w:sz w:val="30"/>
-          <w:szCs w:val="30"/>
-          <w:rtl w:val="0"/>
-        </w:rPr>
-        <w:t xml:space="preserve">Paso 1: Instalar multipass, sudo snap install multipass.</w:t>
-      </w:r>
-    </w:p>
-    <w:p>
-      <w:pPr>
-        <w:rPr>
-          <w:sz w:val="30"/>
-          <w:szCs w:val="30"/>
-        </w:rPr>
-      </w:pPr>
-      <w:r>
-        <w:rPr>
-          <w:rtl w:val="0"/>
-        </w:rPr>
-      </w:r>
-    </w:p>
-    <w:p>
-      <w:pPr>
-        <w:rPr>
-          <w:sz w:val="30"/>
-          <w:szCs w:val="30"/>
-        </w:rPr>
-      </w:pPr>
-      <w:r>
-        <w:rPr>
-          <w:sz w:val="30"/>
-          <w:szCs w:val="30"/>
-          <w:rtl w:val="0"/>
-        </w:rPr>
-        <w:t xml:space="preserve">Paso 2: Crear una imagen desde la interfaz gráfica.</w:t>
-      </w:r>
-    </w:p>
-    <w:p>
-      <w:pPr>
-        <w:rPr>
-          <w:sz w:val="30"/>
-          <w:szCs w:val="30"/>
-        </w:rPr>
-      </w:pPr>
-      <w:r>
-        <w:rPr>
-          <w:rtl w:val="0"/>
-        </w:rPr>
-      </w:r>
-    </w:p>
-    <w:p>
-      <w:pPr>
-        <w:rPr>
-          <w:sz w:val="30"/>
-          <w:szCs w:val="30"/>
-        </w:rPr>
-      </w:pPr>
-      <w:r>
-        <w:rPr>
-          <w:sz w:val="30"/>
-          <w:szCs w:val="30"/>
-          <w:rtl w:val="0"/>
-        </w:rPr>
-        <w:t xml:space="preserve">Paso 3: Entrar a la imagen e instalar docker.</w:t>
-      </w:r>
-    </w:p>
-    <w:p>
-      <w:pPr>
-        <w:rPr>
-          <w:sz w:val="30"/>
-          <w:szCs w:val="30"/>
-        </w:rPr>
-      </w:pPr>
-      <w:r>
-        <w:rPr>
-          <w:rtl w:val="0"/>
-        </w:rPr>
-      </w:r>
-    </w:p>
-    <w:p>
-      <w:pPr>
-        <w:rPr>
-          <w:sz w:val="30"/>
-          <w:szCs w:val="30"/>
-        </w:rPr>
-      </w:pPr>
-      <w:r>
-        <w:rPr>
-          <w:sz w:val="30"/>
-          <w:szCs w:val="30"/>
-          <w:rtl w:val="0"/>
-        </w:rPr>
-        <w:t xml:space="preserve">Paso 4: Paso 4 levantar una imagen de docker con mysql usando sudo al principio.</w:t>
-      </w:r>
-    </w:p>
-    <w:p>
-      <w:pPr>
-        <w:rPr>
-          <w:sz w:val="30"/>
-          <w:szCs w:val="30"/>
-        </w:rPr>
-      </w:pPr>
-      <w:r>
-        <w:rPr>
-          <w:rtl w:val="0"/>
-        </w:rPr>
-      </w:r>
-    </w:p>
-    <w:p>
-      <w:pPr>
-        <w:rPr>
-          <w:sz w:val="30"/>
-          <w:szCs w:val="30"/>
-        </w:rPr>
-      </w:pPr>
-      <w:r>
-        <w:rPr>
-          <w:sz w:val="30"/>
-          <w:szCs w:val="30"/>
-          <w:rtl w:val="0"/>
-        </w:rPr>
-        <w:t xml:space="preserve">Paso 5: copiar este código y reemplazar en </w:t>
-      </w:r>
-      <w:r>
-        <w:rPr>
-          <w:sz w:val="30"/>
-          <w:szCs w:val="30"/>
-          <w:rtl w:val="0"/>
-        </w:rPr>
-        <w:t xml:space="preserve">db.js</w:t>
-      </w:r>
-      <w:r>
-        <w:rPr>
-          <w:sz w:val="30"/>
-          <w:szCs w:val="30"/>
-          <w:rtl w:val="0"/>
-        </w:rPr>
-        <w:t xml:space="preserve"> la IP por la IP privada.</w:t>
-      </w:r>
-    </w:p>
-    <w:p>
-      <w:pPr>
-        <w:rPr>
-          <w:sz w:val="30"/>
-          <w:szCs w:val="30"/>
-        </w:rPr>
-      </w:pPr>
-      <w:r>
-        <w:rPr>
-          <w:sz w:val="30"/>
-          <w:szCs w:val="30"/>
-          <w:rtl w:val="0"/>
-        </w:rPr>
-        <w:t xml:space="preserve">repo: </w:t>
+        <w:t xml:space="preserve">Paso 1: Primero levantar la imagen de docker con el servidor MySQL docker run -d --name db1 -e MYSQL_ROOT_PASSWORD=Lauta -e MYSQL_DATABASE=Hola -p 3306:3306 mysql:8.0</w:t>
+      </w:r>
+    </w:p>
+    <w:p>
+      <w:pPr>
+        <w:rPr>
+          <w:sz w:val="30"/>
+          <w:szCs w:val="30"/>
+        </w:rPr>
+      </w:pPr>
+      <w:r>
+        <w:rPr>
+          <w:rtl w:val="0"/>
+        </w:rPr>
+      </w:r>
+    </w:p>
+    <w:p>
+      <w:pPr>
+        <w:rPr>
+          <w:sz w:val="30"/>
+          <w:szCs w:val="30"/>
+        </w:rPr>
+      </w:pPr>
+      <w:r>
+        <w:rPr>
+          <w:sz w:val="30"/>
+          <w:szCs w:val="30"/>
+          <w:rtl w:val="0"/>
+        </w:rPr>
+        <w:t xml:space="preserve">Paso 2: Dentro del proyecto instalar ‘mysql2’ con “npm i mysql2”</w:t>
+      </w:r>
+    </w:p>
+    <w:p>
+      <w:pPr>
+        <w:rPr>
+          <w:sz w:val="30"/>
+          <w:szCs w:val="30"/>
+        </w:rPr>
+      </w:pPr>
+      <w:r>
+        <w:rPr>
+          <w:rtl w:val="0"/>
+        </w:rPr>
+      </w:r>
+    </w:p>
+    <w:p>
+      <w:pPr>
+        <w:rPr>
+          <w:sz w:val="30"/>
+          <w:szCs w:val="30"/>
+        </w:rPr>
+      </w:pPr>
+      <w:r>
+        <w:rPr>
+          <w:sz w:val="30"/>
+          <w:szCs w:val="30"/>
+          <w:rtl w:val="0"/>
+        </w:rPr>
+        <w:t xml:space="preserve">Repo:</w:t>
       </w:r>
     </w:p>
     <w:p>
@@ -803,6 +524,275 @@
           <w:u w:val="single"/>
           <w:rtl w:val="0"/>
         </w:rPr>
+        <w:t xml:space="preserve">Prueba 2:</w:t>
+      </w:r>
+      <w:r>
+        <w:rPr>
+          <w:sz w:val="30"/>
+          <w:szCs w:val="30"/>
+          <w:rtl w:val="0"/>
+        </w:rPr>
+        <w:t xml:space="preserve"> </w:t>
+      </w:r>
+    </w:p>
+    <w:p>
+      <w:pPr>
+        <w:rPr>
+          <w:sz w:val="30"/>
+          <w:szCs w:val="30"/>
+        </w:rPr>
+      </w:pPr>
+      <w:r>
+        <w:rPr>
+          <w:sz w:val="30"/>
+          <w:szCs w:val="30"/>
+          <w:rtl w:val="0"/>
+        </w:rPr>
+        <w:t xml:space="preserve">Usando Multipass crear una imagen, levantar el servidor MySQL dentro usando docker, conectar la base con una API con ‘mysql2’ y por último hacer ecuaciones CRUD.</w:t>
+      </w:r>
+    </w:p>
+    <w:p>
+      <w:pPr>
+        <w:rPr>
+          <w:sz w:val="30"/>
+          <w:szCs w:val="30"/>
+        </w:rPr>
+      </w:pPr>
+      <w:r>
+        <w:rPr>
+          <w:rtl w:val="0"/>
+        </w:rPr>
+      </w:r>
+    </w:p>
+    <w:p>
+      <w:pPr>
+        <w:rPr>
+          <w:sz w:val="30"/>
+          <w:szCs w:val="30"/>
+        </w:rPr>
+      </w:pPr>
+      <w:r>
+        <w:rPr>
+          <w:sz w:val="30"/>
+          <w:szCs w:val="30"/>
+          <w:rtl w:val="0"/>
+        </w:rPr>
+        <w:t xml:space="preserve">Paso 1: Instalar multipass, sudo snap install multipass.</w:t>
+      </w:r>
+    </w:p>
+    <w:p>
+      <w:pPr>
+        <w:rPr>
+          <w:sz w:val="30"/>
+          <w:szCs w:val="30"/>
+        </w:rPr>
+      </w:pPr>
+      <w:r>
+        <w:rPr>
+          <w:rtl w:val="0"/>
+        </w:rPr>
+      </w:r>
+    </w:p>
+    <w:p>
+      <w:pPr>
+        <w:rPr>
+          <w:sz w:val="30"/>
+          <w:szCs w:val="30"/>
+        </w:rPr>
+      </w:pPr>
+      <w:r>
+        <w:rPr>
+          <w:sz w:val="30"/>
+          <w:szCs w:val="30"/>
+          <w:rtl w:val="0"/>
+        </w:rPr>
+        <w:t xml:space="preserve">Paso 2: Crear una imagen desde la interfaz gráfica.</w:t>
+      </w:r>
+    </w:p>
+    <w:p>
+      <w:pPr>
+        <w:rPr>
+          <w:sz w:val="30"/>
+          <w:szCs w:val="30"/>
+        </w:rPr>
+      </w:pPr>
+      <w:r>
+        <w:rPr>
+          <w:rtl w:val="0"/>
+        </w:rPr>
+      </w:r>
+    </w:p>
+    <w:p>
+      <w:pPr>
+        <w:rPr>
+          <w:sz w:val="30"/>
+          <w:szCs w:val="30"/>
+        </w:rPr>
+      </w:pPr>
+      <w:r>
+        <w:rPr>
+          <w:sz w:val="30"/>
+          <w:szCs w:val="30"/>
+          <w:rtl w:val="0"/>
+        </w:rPr>
+        <w:t xml:space="preserve">Paso 3: Entrar a la imagen e instalar docker.</w:t>
+      </w:r>
+    </w:p>
+    <w:p>
+      <w:pPr>
+        <w:rPr>
+          <w:sz w:val="30"/>
+          <w:szCs w:val="30"/>
+        </w:rPr>
+      </w:pPr>
+      <w:r>
+        <w:rPr>
+          <w:rtl w:val="0"/>
+        </w:rPr>
+      </w:r>
+    </w:p>
+    <w:p>
+      <w:pPr>
+        <w:rPr>
+          <w:sz w:val="30"/>
+          <w:szCs w:val="30"/>
+        </w:rPr>
+      </w:pPr>
+      <w:r>
+        <w:rPr>
+          <w:sz w:val="30"/>
+          <w:szCs w:val="30"/>
+          <w:rtl w:val="0"/>
+        </w:rPr>
+        <w:t xml:space="preserve">Paso 4: Paso 4 levantar una imagen de docker con mysql usando sudo al principio.</w:t>
+      </w:r>
+    </w:p>
+    <w:p>
+      <w:pPr>
+        <w:rPr>
+          <w:sz w:val="30"/>
+          <w:szCs w:val="30"/>
+        </w:rPr>
+      </w:pPr>
+      <w:r>
+        <w:rPr>
+          <w:rtl w:val="0"/>
+        </w:rPr>
+      </w:r>
+    </w:p>
+    <w:p>
+      <w:pPr>
+        <w:rPr>
+          <w:sz w:val="30"/>
+          <w:szCs w:val="30"/>
+        </w:rPr>
+      </w:pPr>
+      <w:r>
+        <w:rPr>
+          <w:sz w:val="30"/>
+          <w:szCs w:val="30"/>
+          <w:rtl w:val="0"/>
+        </w:rPr>
+        <w:t xml:space="preserve">Paso 5: copiar este código y reemplazar en </w:t>
+      </w:r>
+      <w:r>
+        <w:rPr>
+          <w:sz w:val="30"/>
+          <w:szCs w:val="30"/>
+          <w:rtl w:val="0"/>
+        </w:rPr>
+        <w:t xml:space="preserve">db.js</w:t>
+      </w:r>
+      <w:r>
+        <w:rPr>
+          <w:sz w:val="30"/>
+          <w:szCs w:val="30"/>
+          <w:rtl w:val="0"/>
+        </w:rPr>
+        <w:t xml:space="preserve"> la IP por la IP privada.</w:t>
+      </w:r>
+    </w:p>
+    <w:p>
+      <w:pPr>
+        <w:rPr>
+          <w:sz w:val="30"/>
+          <w:szCs w:val="30"/>
+        </w:rPr>
+      </w:pPr>
+      <w:r>
+        <w:rPr>
+          <w:rtl w:val="0"/>
+        </w:rPr>
+      </w:r>
+    </w:p>
+    <w:p>
+      <w:pPr>
+        <w:rPr>
+          <w:sz w:val="30"/>
+          <w:szCs w:val="30"/>
+        </w:rPr>
+      </w:pPr>
+      <w:r>
+        <w:rPr>
+          <w:sz w:val="30"/>
+          <w:szCs w:val="30"/>
+          <w:rtl w:val="0"/>
+        </w:rPr>
+        <w:t xml:space="preserve">repo: </w:t>
+      </w:r>
+    </w:p>
+    <w:p>
+      <w:pPr>
+        <w:rPr>
+          <w:sz w:val="30"/>
+          <w:szCs w:val="30"/>
+        </w:rPr>
+      </w:pPr>
+      <w:hyperlink r:id="rId8">
+        <w:r>
+          <w:rPr>
+            <w:color w:val="1155cc"/>
+            <w:sz w:val="30"/>
+            <w:szCs w:val="30"/>
+            <w:u w:val="single"/>
+            <w:rtl w:val="0"/>
+          </w:rPr>
+          <w:t xml:space="preserve">https://github.com/Lautaro-1212/pruebasReplicacionMySQL_TiendaNegocio</w:t>
+        </w:r>
+      </w:hyperlink>
+      <w:r>
+        <w:rPr>
+          <w:rtl w:val="0"/>
+        </w:rPr>
+      </w:r>
+    </w:p>
+    <w:p>
+      <w:pPr>
+        <w:rPr>
+          <w:sz w:val="30"/>
+          <w:szCs w:val="30"/>
+        </w:rPr>
+      </w:pPr>
+      <w:r>
+        <w:rPr>
+          <w:rtl w:val="0"/>
+        </w:rPr>
+      </w:r>
+    </w:p>
+    <w:p>
+      <w:pPr>
+        <w:rPr>
+          <w:sz w:val="30"/>
+          <w:szCs w:val="30"/>
+        </w:rPr>
+      </w:pPr>
+      <w:r>
+        <w:rPr>
+          <w:sz w:val="30"/>
+          <w:szCs w:val="30"/>
+          <w:u w:val="single"/>
+          <w:rtl w:val="0"/>
+        </w:rPr>
         <w:t xml:space="preserve">Prueba 3:</w:t>
       </w:r>
       <w:r>
@@ -827,7 +817,7 @@
           <w:szCs w:val="30"/>
           <w:rtl w:val="0"/>
         </w:rPr>
-        <w:t xml:space="preserve"> Crear tres servidores SQL, cada en un docker compose. Y tratar de replicar la configuración Master Slave.</w:t>
+        <w:t xml:space="preserve"> Crear tres servidores MySQL, cada uno en un docker compose. Y tratar de replicar la configuración Master Slave.</w:t>
       </w:r>
     </w:p>
     <w:p>
@@ -959,59 +949,792 @@
           <w:szCs w:val="30"/>
           <w:rtl w:val="0"/>
         </w:rPr>
-        <w:t xml:space="preserve">repo: https://github.com/Lautaro-1212/pruebasReplicacionMySQL_TiendaNegocio</w:t>
-      </w:r>
-    </w:p>
-    <w:p>
-      <w:pPr>
-        <w:rPr>
-          <w:sz w:val="30"/>
-          <w:szCs w:val="30"/>
-        </w:rPr>
-      </w:pPr>
-      <w:r>
-        <w:rPr>
-          <w:rtl w:val="0"/>
-        </w:rPr>
-      </w:r>
-    </w:p>
-    <w:p>
-      <w:pPr>
-        <w:rPr>
-          <w:sz w:val="30"/>
-          <w:szCs w:val="30"/>
-        </w:rPr>
-      </w:pPr>
-      <w:r>
-        <w:rPr>
-          <w:rtl w:val="0"/>
-        </w:rPr>
-      </w:r>
-    </w:p>
-    <w:p>
-      <w:pPr>
-        <w:rPr>
-          <w:sz w:val="30"/>
-          <w:szCs w:val="30"/>
-        </w:rPr>
-      </w:pPr>
-      <w:r>
-        <w:rPr>
-          <w:rtl w:val="0"/>
-        </w:rPr>
-      </w:r>
-    </w:p>
-    <w:p>
-      <w:pPr>
-        <w:rPr>
-          <w:sz w:val="30"/>
-          <w:szCs w:val="30"/>
-        </w:rPr>
-      </w:pPr>
-      <w:r>
-        <w:rPr>
-          <w:rtl w:val="0"/>
-        </w:rPr>
+        <w:t xml:space="preserve">repo: </w:t>
+      </w:r>
+      <w:hyperlink r:id="rId9">
+        <w:r>
+          <w:rPr>
+            <w:color w:val="1155cc"/>
+            <w:sz w:val="30"/>
+            <w:szCs w:val="30"/>
+            <w:u w:val="single"/>
+            <w:rtl w:val="0"/>
+          </w:rPr>
+          <w:t xml:space="preserve">https://github.com/Lautaro-1212/pruebasReplicacionMySQL_TiendaNegocio</w:t>
+        </w:r>
+      </w:hyperlink>
+      <w:r>
+        <w:rPr>
+          <w:rtl w:val="0"/>
+        </w:rPr>
+      </w:r>
+    </w:p>
+    <w:p>
+      <w:pPr>
+        <w:rPr>
+          <w:sz w:val="30"/>
+          <w:szCs w:val="30"/>
+        </w:rPr>
+      </w:pPr>
+      <w:r>
+        <w:rPr>
+          <w:rtl w:val="0"/>
+        </w:rPr>
+      </w:r>
+    </w:p>
+    <w:p>
+      <w:pPr>
+        <w:rPr>
+          <w:sz w:val="30"/>
+          <w:szCs w:val="30"/>
+          <w:u w:val="single"/>
+        </w:rPr>
+      </w:pPr>
+      <w:r>
+        <w:rPr>
+          <w:rtl w:val="0"/>
+        </w:rPr>
+      </w:r>
+    </w:p>
+    <w:p>
+      <w:pPr>
+        <w:rPr>
+          <w:sz w:val="30"/>
+          <w:szCs w:val="30"/>
+          <w:u w:val="single"/>
+        </w:rPr>
+      </w:pPr>
+      <w:r>
+        <w:rPr>
+          <w:rtl w:val="0"/>
+        </w:rPr>
+      </w:r>
+    </w:p>
+    <w:p>
+      <w:pPr>
+        <w:rPr>
+          <w:sz w:val="30"/>
+          <w:szCs w:val="30"/>
+          <w:u w:val="single"/>
+        </w:rPr>
+      </w:pPr>
+      <w:r>
+        <w:rPr>
+          <w:rtl w:val="0"/>
+        </w:rPr>
+      </w:r>
+    </w:p>
+    <w:p>
+      <w:pPr>
+        <w:rPr>
+          <w:sz w:val="30"/>
+          <w:szCs w:val="30"/>
+          <w:u w:val="single"/>
+        </w:rPr>
+      </w:pPr>
+      <w:r>
+        <w:rPr>
+          <w:rtl w:val="0"/>
+        </w:rPr>
+      </w:r>
+    </w:p>
+    <w:p>
+      <w:pPr>
+        <w:rPr>
+          <w:sz w:val="30"/>
+          <w:szCs w:val="30"/>
+          <w:u w:val="single"/>
+        </w:rPr>
+      </w:pPr>
+      <w:r>
+        <w:rPr>
+          <w:rtl w:val="0"/>
+        </w:rPr>
+      </w:r>
+    </w:p>
+    <w:p>
+      <w:pPr>
+        <w:rPr>
+          <w:sz w:val="30"/>
+          <w:szCs w:val="30"/>
+          <w:u w:val="single"/>
+        </w:rPr>
+      </w:pPr>
+      <w:r>
+        <w:rPr>
+          <w:rtl w:val="0"/>
+        </w:rPr>
+      </w:r>
+    </w:p>
+    <w:p>
+      <w:pPr>
+        <w:rPr>
+          <w:sz w:val="30"/>
+          <w:szCs w:val="30"/>
+          <w:u w:val="single"/>
+        </w:rPr>
+      </w:pPr>
+      <w:r>
+        <w:rPr>
+          <w:rtl w:val="0"/>
+        </w:rPr>
+      </w:r>
+    </w:p>
+    <w:p>
+      <w:pPr>
+        <w:rPr>
+          <w:sz w:val="30"/>
+          <w:szCs w:val="30"/>
+          <w:u w:val="single"/>
+        </w:rPr>
+      </w:pPr>
+      <w:r>
+        <w:rPr>
+          <w:rtl w:val="0"/>
+        </w:rPr>
+      </w:r>
+    </w:p>
+    <w:p>
+      <w:pPr>
+        <w:rPr>
+          <w:sz w:val="30"/>
+          <w:szCs w:val="30"/>
+          <w:u w:val="single"/>
+        </w:rPr>
+      </w:pPr>
+      <w:r>
+        <w:rPr>
+          <w:rtl w:val="0"/>
+        </w:rPr>
+      </w:r>
+    </w:p>
+    <w:p>
+      <w:pPr>
+        <w:rPr>
+          <w:sz w:val="30"/>
+          <w:szCs w:val="30"/>
+          <w:u w:val="single"/>
+        </w:rPr>
+      </w:pPr>
+      <w:r>
+        <w:rPr>
+          <w:rtl w:val="0"/>
+        </w:rPr>
+      </w:r>
+    </w:p>
+    <w:p>
+      <w:pPr>
+        <w:rPr>
+          <w:sz w:val="30"/>
+          <w:szCs w:val="30"/>
+          <w:u w:val="single"/>
+        </w:rPr>
+      </w:pPr>
+      <w:r>
+        <w:rPr>
+          <w:rtl w:val="0"/>
+        </w:rPr>
+      </w:r>
+    </w:p>
+    <w:p>
+      <w:pPr>
+        <w:rPr>
+          <w:sz w:val="30"/>
+          <w:szCs w:val="30"/>
+          <w:u w:val="single"/>
+        </w:rPr>
+      </w:pPr>
+      <w:r>
+        <w:rPr>
+          <w:rtl w:val="0"/>
+        </w:rPr>
+      </w:r>
+    </w:p>
+    <w:p>
+      <w:pPr>
+        <w:rPr>
+          <w:sz w:val="30"/>
+          <w:szCs w:val="30"/>
+        </w:rPr>
+      </w:pPr>
+      <w:r>
+        <w:rPr>
+          <w:sz w:val="30"/>
+          <w:szCs w:val="30"/>
+          <w:u w:val="single"/>
+          <w:rtl w:val="0"/>
+        </w:rPr>
+        <w:t xml:space="preserve">Prueba 4:</w:t>
+      </w:r>
+      <w:r>
+        <w:rPr>
+          <w:sz w:val="30"/>
+          <w:szCs w:val="30"/>
+          <w:rtl w:val="0"/>
+        </w:rPr>
+        <w:t xml:space="preserve"> </w:t>
+      </w:r>
+    </w:p>
+    <w:p>
+      <w:pPr>
+        <w:rPr>
+          <w:sz w:val="30"/>
+          <w:szCs w:val="30"/>
+        </w:rPr>
+      </w:pPr>
+      <w:r>
+        <w:rPr>
+          <w:sz w:val="30"/>
+          <w:szCs w:val="30"/>
+          <w:rtl w:val="0"/>
+        </w:rPr>
+        <w:t xml:space="preserve"> Crear 3 servidores MySQL con un docker compose, con la configuración de Master Slave, y que de intermediario entre la API y el máster haya un Wrapper hecho con ProxySQL.</w:t>
+      </w:r>
+    </w:p>
+    <w:p>
+      <w:pPr>
+        <w:rPr>
+          <w:sz w:val="30"/>
+          <w:szCs w:val="30"/>
+        </w:rPr>
+      </w:pPr>
+      <w:r>
+        <w:rPr>
+          <w:rtl w:val="0"/>
+        </w:rPr>
+      </w:r>
+    </w:p>
+    <w:p>
+      <w:pPr>
+        <w:rPr>
+          <w:sz w:val="30"/>
+          <w:szCs w:val="30"/>
+        </w:rPr>
+      </w:pPr>
+      <w:r>
+        <w:rPr>
+          <w:sz w:val="30"/>
+          <w:szCs w:val="30"/>
+          <w:rtl w:val="0"/>
+        </w:rPr>
+        <w:t xml:space="preserve">Imagen de cómo se vería actualmente con esta configuración:</w:t>
+      </w:r>
+    </w:p>
+    <w:p>
+      <w:pPr>
+        <w:rPr>
+          <w:sz w:val="30"/>
+          <w:szCs w:val="30"/>
+        </w:rPr>
+      </w:pPr>
+      <w:r>
+        <w:rPr>
+          <w:sz w:val="30"/>
+          <w:szCs w:val="30"/>
+          <w:rtl w:val="0"/>
+        </w:rPr>
+        <w:t xml:space="preserve"> </w:t>
+      </w:r>
+    </w:p>
+    <w:p>
+      <w:pPr>
+        <w:rPr>
+          <w:sz w:val="30"/>
+          <w:szCs w:val="30"/>
+        </w:rPr>
+      </w:pPr>
+      <w:r>
+        <w:rPr>
+          <w:sz w:val="30"/>
+          <w:szCs w:val="30"/>
+          <w:rtl w:val="0"/>
+        </w:rPr>
+        <w:t xml:space="preserve">       Frontend / Node</w:t>
+      </w:r>
+    </w:p>
+    <w:p>
+      <w:pPr>
+        <w:rPr>
+          <w:sz w:val="30"/>
+          <w:szCs w:val="30"/>
+        </w:rPr>
+      </w:pPr>
+      <w:r>
+        <w:rPr>
+          <w:sz w:val="30"/>
+          <w:szCs w:val="30"/>
+          <w:rtl w:val="0"/>
+        </w:rPr>
+        <w:t xml:space="preserve">             │</w:t>
+      </w:r>
+    </w:p>
+    <w:p>
+      <w:pPr>
+        <w:rPr>
+          <w:sz w:val="30"/>
+          <w:szCs w:val="30"/>
+        </w:rPr>
+      </w:pPr>
+      <w:r>
+        <w:rPr>
+          <w:sz w:val="30"/>
+          <w:szCs w:val="30"/>
+          <w:rtl w:val="0"/>
+        </w:rPr>
+        <w:t xml:space="preserve">             │ :6033</w:t>
+      </w:r>
+    </w:p>
+    <w:p>
+      <w:pPr>
+        <w:rPr>
+          <w:sz w:val="30"/>
+          <w:szCs w:val="30"/>
+        </w:rPr>
+      </w:pPr>
+      <w:r>
+        <w:rPr>
+          <w:sz w:val="30"/>
+          <w:szCs w:val="30"/>
+          <w:rtl w:val="0"/>
+        </w:rPr>
+        <w:t xml:space="preserve">             ▼</w:t>
+      </w:r>
+    </w:p>
+    <w:p>
+      <w:pPr>
+        <w:rPr>
+          <w:sz w:val="30"/>
+          <w:szCs w:val="30"/>
+        </w:rPr>
+      </w:pPr>
+      <w:r>
+        <w:rPr>
+          <w:sz w:val="30"/>
+          <w:szCs w:val="30"/>
+          <w:rtl w:val="0"/>
+        </w:rPr>
+        <w:t xml:space="preserve">          ProxySQL</w:t>
+      </w:r>
+    </w:p>
+    <w:p>
+      <w:pPr>
+        <w:rPr>
+          <w:sz w:val="30"/>
+          <w:szCs w:val="30"/>
+        </w:rPr>
+      </w:pPr>
+      <w:r>
+        <w:rPr>
+          <w:sz w:val="30"/>
+          <w:szCs w:val="30"/>
+          <w:rtl w:val="0"/>
+        </w:rPr>
+        <w:t xml:space="preserve">             │</w:t>
+      </w:r>
+    </w:p>
+    <w:p>
+      <w:pPr>
+        <w:rPr>
+          <w:sz w:val="30"/>
+          <w:szCs w:val="30"/>
+        </w:rPr>
+      </w:pPr>
+      <w:r>
+        <w:rPr>
+          <w:sz w:val="30"/>
+          <w:szCs w:val="30"/>
+          <w:rtl w:val="0"/>
+        </w:rPr>
+        <w:t xml:space="preserve">       ┌─────┴─────┐</w:t>
+      </w:r>
+    </w:p>
+    <w:p>
+      <w:pPr>
+        <w:rPr>
+          <w:sz w:val="30"/>
+          <w:szCs w:val="30"/>
+        </w:rPr>
+      </w:pPr>
+      <w:r>
+        <w:rPr>
+          <w:sz w:val="30"/>
+          <w:szCs w:val="30"/>
+          <w:rtl w:val="0"/>
+        </w:rPr>
+        <w:t xml:space="preserve">       │              │</w:t>
+      </w:r>
+    </w:p>
+    <w:p>
+      <w:pPr>
+        <w:rPr>
+          <w:sz w:val="30"/>
+          <w:szCs w:val="30"/>
+        </w:rPr>
+      </w:pPr>
+      <w:r>
+        <w:rPr>
+          <w:sz w:val="30"/>
+          <w:szCs w:val="30"/>
+          <w:rtl w:val="0"/>
+        </w:rPr>
+        <w:t xml:space="preserve">    SELECT        INSERT</w:t>
+      </w:r>
+    </w:p>
+    <w:p>
+      <w:pPr>
+        <w:rPr>
+          <w:sz w:val="30"/>
+          <w:szCs w:val="30"/>
+        </w:rPr>
+      </w:pPr>
+      <w:r>
+        <w:rPr>
+          <w:sz w:val="30"/>
+          <w:szCs w:val="30"/>
+          <w:rtl w:val="0"/>
+        </w:rPr>
+        <w:t xml:space="preserve">       │           │</w:t>
+      </w:r>
+    </w:p>
+    <w:p>
+      <w:pPr>
+        <w:rPr>
+          <w:sz w:val="30"/>
+          <w:szCs w:val="30"/>
+        </w:rPr>
+      </w:pPr>
+      <w:r>
+        <w:rPr>
+          <w:sz w:val="30"/>
+          <w:szCs w:val="30"/>
+          <w:rtl w:val="0"/>
+        </w:rPr>
+        <w:t xml:space="preserve">       ▼           ▼</w:t>
+      </w:r>
+    </w:p>
+    <w:p>
+      <w:pPr>
+        <w:rPr>
+          <w:sz w:val="30"/>
+          <w:szCs w:val="30"/>
+        </w:rPr>
+      </w:pPr>
+      <w:r>
+        <w:rPr>
+          <w:sz w:val="30"/>
+          <w:szCs w:val="30"/>
+          <w:rtl w:val="0"/>
+        </w:rPr>
+        <w:t xml:space="preserve">    slaves       master</w:t>
+      </w:r>
+    </w:p>
+    <w:p>
+      <w:pPr>
+        <w:rPr>
+          <w:sz w:val="30"/>
+          <w:szCs w:val="30"/>
+        </w:rPr>
+      </w:pPr>
+      <w:r>
+        <w:rPr>
+          <w:rtl w:val="0"/>
+        </w:rPr>
+      </w:r>
+    </w:p>
+    <w:p>
+      <w:pPr>
+        <w:rPr>
+          <w:sz w:val="30"/>
+          <w:szCs w:val="30"/>
+        </w:rPr>
+      </w:pPr>
+      <w:r>
+        <w:rPr>
+          <w:sz w:val="30"/>
+          <w:szCs w:val="30"/>
+          <w:rtl w:val="0"/>
+        </w:rPr>
+        <w:t xml:space="preserve">Cómo probar la app: </w:t>
+      </w:r>
+    </w:p>
+    <w:p>
+      <w:pPr>
+        <w:rPr>
+          <w:sz w:val="30"/>
+          <w:szCs w:val="30"/>
+        </w:rPr>
+      </w:pPr>
+      <w:r>
+        <w:rPr>
+          <w:sz w:val="30"/>
+          <w:szCs w:val="30"/>
+          <w:rtl w:val="0"/>
+        </w:rPr>
+        <w:t xml:space="preserve">Paso 1: Clonar el repo</w:t>
+      </w:r>
+    </w:p>
+    <w:p>
+      <w:pPr>
+        <w:rPr>
+          <w:sz w:val="30"/>
+          <w:szCs w:val="30"/>
+        </w:rPr>
+      </w:pPr>
+      <w:r>
+        <w:rPr>
+          <w:rtl w:val="0"/>
+        </w:rPr>
+      </w:r>
+    </w:p>
+    <w:p>
+      <w:pPr>
+        <w:rPr>
+          <w:sz w:val="30"/>
+          <w:szCs w:val="30"/>
+        </w:rPr>
+      </w:pPr>
+      <w:r>
+        <w:rPr>
+          <w:sz w:val="30"/>
+          <w:szCs w:val="30"/>
+          <w:rtl w:val="0"/>
+        </w:rPr>
+        <w:t xml:space="preserve">Paso 2: Ir a /mysql-replication y hacer “docker compose up” en una terminal, hasta que la terminal diga que las configuraciones ya están hechas. </w:t>
+      </w:r>
+    </w:p>
+    <w:p>
+      <w:pPr>
+        <w:rPr>
+          <w:sz w:val="30"/>
+          <w:szCs w:val="30"/>
+        </w:rPr>
+      </w:pPr>
+      <w:r>
+        <w:rPr>
+          <w:rtl w:val="0"/>
+        </w:rPr>
+      </w:r>
+    </w:p>
+    <w:p>
+      <w:pPr>
+        <w:rPr>
+          <w:sz w:val="30"/>
+          <w:szCs w:val="30"/>
+        </w:rPr>
+      </w:pPr>
+      <w:r>
+        <w:rPr>
+          <w:sz w:val="30"/>
+          <w:szCs w:val="30"/>
+          <w:rtl w:val="0"/>
+        </w:rPr>
+        <w:t xml:space="preserve">Paso 3: Ir a JS/Apps y en otro terminal tirar “node </w:t>
+      </w:r>
+      <w:r>
+        <w:rPr>
+          <w:sz w:val="30"/>
+          <w:szCs w:val="30"/>
+          <w:rtl w:val="0"/>
+        </w:rPr>
+        <w:t xml:space="preserve">wrapperApp.js</w:t>
+      </w:r>
+      <w:r>
+        <w:rPr>
+          <w:sz w:val="30"/>
+          <w:szCs w:val="30"/>
+          <w:rtl w:val="0"/>
+        </w:rPr>
+        <w:t xml:space="preserve">”  para comunicarte con el wrapper.</w:t>
+      </w:r>
+    </w:p>
+    <w:p>
+      <w:pPr>
+        <w:rPr>
+          <w:sz w:val="30"/>
+          <w:szCs w:val="30"/>
+        </w:rPr>
+      </w:pPr>
+      <w:r>
+        <w:rPr>
+          <w:rtl w:val="0"/>
+        </w:rPr>
+      </w:r>
+    </w:p>
+    <w:p>
+      <w:pPr>
+        <w:rPr>
+          <w:sz w:val="30"/>
+          <w:szCs w:val="30"/>
+        </w:rPr>
+      </w:pPr>
+      <w:r>
+        <w:rPr>
+          <w:b w:val="1"/>
+          <w:bCs w:val="1"/>
+          <w:sz w:val="30"/>
+          <w:szCs w:val="30"/>
+          <w:rtl w:val="0"/>
+        </w:rPr>
+        <w:t xml:space="preserve">Aclaraciones:</w:t>
+      </w:r>
+      <w:r>
+        <w:rPr>
+          <w:sz w:val="30"/>
+          <w:szCs w:val="30"/>
+          <w:rtl w:val="0"/>
+        </w:rPr>
+        <w:t xml:space="preserve"> Dentro de “</w:t>
+      </w:r>
+      <w:r>
+        <w:rPr>
+          <w:sz w:val="30"/>
+          <w:szCs w:val="30"/>
+          <w:rtl w:val="0"/>
+        </w:rPr>
+        <w:t xml:space="preserve">wrapperApp.js</w:t>
+      </w:r>
+      <w:r>
+        <w:rPr>
+          <w:sz w:val="30"/>
+          <w:szCs w:val="30"/>
+          <w:rtl w:val="0"/>
+        </w:rPr>
+        <w:t xml:space="preserve">”</w:t>
+      </w:r>
+      <w:r>
+        <w:rPr>
+          <w:sz w:val="30"/>
+          <w:szCs w:val="30"/>
+          <w:rtl w:val="0"/>
+        </w:rPr>
+        <w:t xml:space="preserve"> hay 4 métodos:</w:t>
+      </w:r>
+    </w:p>
+    <w:p>
+      <w:pPr>
+        <w:rPr>
+          <w:sz w:val="30"/>
+          <w:szCs w:val="30"/>
+        </w:rPr>
+      </w:pPr>
+      <w:r>
+        <w:rPr>
+          <w:sz w:val="30"/>
+          <w:szCs w:val="30"/>
+          <w:rtl w:val="0"/>
+        </w:rPr>
+        <w:t xml:space="preserve">createTableProductos</w:t>
+      </w:r>
+      <w:r>
+        <w:rPr>
+          <w:sz w:val="30"/>
+          <w:szCs w:val="30"/>
+          <w:rtl w:val="0"/>
+        </w:rPr>
+        <w:t xml:space="preserve">(): Crea la tabla donde se harán las consultas.</w:t>
+      </w:r>
+    </w:p>
+    <w:p>
+      <w:pPr>
+        <w:rPr>
+          <w:sz w:val="30"/>
+          <w:szCs w:val="30"/>
+        </w:rPr>
+      </w:pPr>
+      <w:r>
+        <w:rPr>
+          <w:rtl w:val="0"/>
+        </w:rPr>
+      </w:r>
+    </w:p>
+    <w:p>
+      <w:pPr>
+        <w:rPr>
+          <w:sz w:val="30"/>
+          <w:szCs w:val="30"/>
+        </w:rPr>
+      </w:pPr>
+      <w:r>
+        <w:rPr>
+          <w:sz w:val="30"/>
+          <w:szCs w:val="30"/>
+          <w:rtl w:val="0"/>
+        </w:rPr>
+        <w:t xml:space="preserve">InsertProducts</w:t>
+      </w:r>
+      <w:r>
+        <w:rPr>
+          <w:sz w:val="30"/>
+          <w:szCs w:val="30"/>
+          <w:rtl w:val="0"/>
+        </w:rPr>
+        <w:t xml:space="preserve">(producto): Hace un insert de lo que le pases por parámetro. </w:t>
+      </w:r>
+    </w:p>
+    <w:p>
+      <w:pPr>
+        <w:rPr>
+          <w:sz w:val="30"/>
+          <w:szCs w:val="30"/>
+        </w:rPr>
+      </w:pPr>
+      <w:r>
+        <w:rPr>
+          <w:rtl w:val="0"/>
+        </w:rPr>
+      </w:r>
+    </w:p>
+    <w:p>
+      <w:pPr>
+        <w:rPr>
+          <w:sz w:val="30"/>
+          <w:szCs w:val="30"/>
+        </w:rPr>
+      </w:pPr>
+      <w:r>
+        <w:rPr>
+          <w:sz w:val="30"/>
+          <w:szCs w:val="30"/>
+          <w:rtl w:val="0"/>
+        </w:rPr>
+        <w:t xml:space="preserve">getProducts(): Devuelve todos las filas de la tabla productos. </w:t>
+      </w:r>
+    </w:p>
+    <w:p>
+      <w:pPr>
+        <w:rPr>
+          <w:sz w:val="30"/>
+          <w:szCs w:val="30"/>
+        </w:rPr>
+      </w:pPr>
+      <w:r>
+        <w:rPr>
+          <w:rtl w:val="0"/>
+        </w:rPr>
+      </w:r>
+    </w:p>
+    <w:p>
+      <w:pPr>
+        <w:rPr>
+          <w:sz w:val="30"/>
+          <w:szCs w:val="30"/>
+        </w:rPr>
+      </w:pPr>
+      <w:r>
+        <w:rPr>
+          <w:sz w:val="30"/>
+          <w:szCs w:val="30"/>
+          <w:rtl w:val="0"/>
+        </w:rPr>
+        <w:t xml:space="preserve">empetyTable</w:t>
+      </w:r>
+      <w:r>
+        <w:rPr>
+          <w:sz w:val="30"/>
+          <w:szCs w:val="30"/>
+          <w:rtl w:val="0"/>
+        </w:rPr>
+        <w:t xml:space="preserve">(): Vacía la tabla de productos. </w:t>
       </w:r>
     </w:p>
     <w:p>

</xml_diff>